<commit_message>
Add project report with citations
</commit_message>
<xml_diff>
--- a/Weather_Pipeline_Project_Report.docx
+++ b/Weather_Pipeline_Project_Report.docx
@@ -375,12 +375,6 @@
         <w:gridCol w:w="3120"/>
       </w:tblGrid>
       <w:tr>
-        <w:tblPrEx>
-          <w:tblCellMar>
-            <w:top w:w="0" w:type="dxa"/>
-            <w:bottom w:w="0" w:type="dxa"/>
-          </w:tblCellMar>
-        </w:tblPrEx>
         <w:tc>
           <w:tcPr>
             <w:tcW w:w="3120" w:type="dxa"/>
@@ -491,12 +485,6 @@
         </w:tc>
       </w:tr>
       <w:tr>
-        <w:tblPrEx>
-          <w:tblCellMar>
-            <w:top w:w="0" w:type="dxa"/>
-            <w:bottom w:w="0" w:type="dxa"/>
-          </w:tblCellMar>
-        </w:tblPrEx>
         <w:tc>
           <w:tcPr>
             <w:tcW w:w="3120" w:type="dxa"/>
@@ -598,12 +586,6 @@
         </w:tc>
       </w:tr>
       <w:tr>
-        <w:tblPrEx>
-          <w:tblCellMar>
-            <w:top w:w="0" w:type="dxa"/>
-            <w:bottom w:w="0" w:type="dxa"/>
-          </w:tblCellMar>
-        </w:tblPrEx>
         <w:tc>
           <w:tcPr>
             <w:tcW w:w="3120" w:type="dxa"/>
@@ -705,12 +687,6 @@
         </w:tc>
       </w:tr>
       <w:tr>
-        <w:tblPrEx>
-          <w:tblCellMar>
-            <w:top w:w="0" w:type="dxa"/>
-            <w:bottom w:w="0" w:type="dxa"/>
-          </w:tblCellMar>
-        </w:tblPrEx>
         <w:tc>
           <w:tcPr>
             <w:tcW w:w="3120" w:type="dxa"/>
@@ -812,12 +788,6 @@
         </w:tc>
       </w:tr>
       <w:tr>
-        <w:tblPrEx>
-          <w:tblCellMar>
-            <w:top w:w="0" w:type="dxa"/>
-            <w:bottom w:w="0" w:type="dxa"/>
-          </w:tblCellMar>
-        </w:tblPrEx>
         <w:tc>
           <w:tcPr>
             <w:tcW w:w="3120" w:type="dxa"/>
@@ -919,12 +889,6 @@
         </w:tc>
       </w:tr>
       <w:tr>
-        <w:tblPrEx>
-          <w:tblCellMar>
-            <w:top w:w="0" w:type="dxa"/>
-            <w:bottom w:w="0" w:type="dxa"/>
-          </w:tblCellMar>
-        </w:tblPrEx>
         <w:tc>
           <w:tcPr>
             <w:tcW w:w="3120" w:type="dxa"/>
@@ -1637,12 +1601,6 @@
         <w:gridCol w:w="3120"/>
       </w:tblGrid>
       <w:tr>
-        <w:tblPrEx>
-          <w:tblCellMar>
-            <w:top w:w="0" w:type="dxa"/>
-            <w:bottom w:w="0" w:type="dxa"/>
-          </w:tblCellMar>
-        </w:tblPrEx>
         <w:tc>
           <w:tcPr>
             <w:tcW w:w="3120" w:type="dxa"/>
@@ -1753,12 +1711,6 @@
         </w:tc>
       </w:tr>
       <w:tr>
-        <w:tblPrEx>
-          <w:tblCellMar>
-            <w:top w:w="0" w:type="dxa"/>
-            <w:bottom w:w="0" w:type="dxa"/>
-          </w:tblCellMar>
-        </w:tblPrEx>
         <w:tc>
           <w:tcPr>
             <w:tcW w:w="3120" w:type="dxa"/>
@@ -1860,12 +1812,6 @@
         </w:tc>
       </w:tr>
       <w:tr>
-        <w:tblPrEx>
-          <w:tblCellMar>
-            <w:top w:w="0" w:type="dxa"/>
-            <w:bottom w:w="0" w:type="dxa"/>
-          </w:tblCellMar>
-        </w:tblPrEx>
         <w:tc>
           <w:tcPr>
             <w:tcW w:w="3120" w:type="dxa"/>
@@ -1967,12 +1913,6 @@
         </w:tc>
       </w:tr>
       <w:tr>
-        <w:tblPrEx>
-          <w:tblCellMar>
-            <w:top w:w="0" w:type="dxa"/>
-            <w:bottom w:w="0" w:type="dxa"/>
-          </w:tblCellMar>
-        </w:tblPrEx>
         <w:tc>
           <w:tcPr>
             <w:tcW w:w="3120" w:type="dxa"/>
@@ -2074,12 +2014,6 @@
         </w:tc>
       </w:tr>
       <w:tr>
-        <w:tblPrEx>
-          <w:tblCellMar>
-            <w:top w:w="0" w:type="dxa"/>
-            <w:bottom w:w="0" w:type="dxa"/>
-          </w:tblCellMar>
-        </w:tblPrEx>
         <w:tc>
           <w:tcPr>
             <w:tcW w:w="3120" w:type="dxa"/>
@@ -2181,12 +2115,6 @@
         </w:tc>
       </w:tr>
       <w:tr>
-        <w:tblPrEx>
-          <w:tblCellMar>
-            <w:top w:w="0" w:type="dxa"/>
-            <w:bottom w:w="0" w:type="dxa"/>
-          </w:tblCellMar>
-        </w:tblPrEx>
         <w:tc>
           <w:tcPr>
             <w:tcW w:w="3120" w:type="dxa"/>
@@ -3478,12 +3406,6 @@
         <w:gridCol w:w="4680"/>
       </w:tblGrid>
       <w:tr>
-        <w:tblPrEx>
-          <w:tblCellMar>
-            <w:top w:w="0" w:type="dxa"/>
-            <w:bottom w:w="0" w:type="dxa"/>
-          </w:tblCellMar>
-        </w:tblPrEx>
         <w:tc>
           <w:tcPr>
             <w:tcW w:w="2340" w:type="dxa"/>
@@ -3594,12 +3516,6 @@
         </w:tc>
       </w:tr>
       <w:tr>
-        <w:tblPrEx>
-          <w:tblCellMar>
-            <w:top w:w="0" w:type="dxa"/>
-            <w:bottom w:w="0" w:type="dxa"/>
-          </w:tblCellMar>
-        </w:tblPrEx>
         <w:tc>
           <w:tcPr>
             <w:tcW w:w="2340" w:type="dxa"/>
@@ -3701,12 +3617,6 @@
         </w:tc>
       </w:tr>
       <w:tr>
-        <w:tblPrEx>
-          <w:tblCellMar>
-            <w:top w:w="0" w:type="dxa"/>
-            <w:bottom w:w="0" w:type="dxa"/>
-          </w:tblCellMar>
-        </w:tblPrEx>
         <w:tc>
           <w:tcPr>
             <w:tcW w:w="2340" w:type="dxa"/>
@@ -3808,12 +3718,6 @@
         </w:tc>
       </w:tr>
       <w:tr>
-        <w:tblPrEx>
-          <w:tblCellMar>
-            <w:top w:w="0" w:type="dxa"/>
-            <w:bottom w:w="0" w:type="dxa"/>
-          </w:tblCellMar>
-        </w:tblPrEx>
         <w:tc>
           <w:tcPr>
             <w:tcW w:w="2340" w:type="dxa"/>
@@ -3915,12 +3819,6 @@
         </w:tc>
       </w:tr>
       <w:tr>
-        <w:tblPrEx>
-          <w:tblCellMar>
-            <w:top w:w="0" w:type="dxa"/>
-            <w:bottom w:w="0" w:type="dxa"/>
-          </w:tblCellMar>
-        </w:tblPrEx>
         <w:tc>
           <w:tcPr>
             <w:tcW w:w="2340" w:type="dxa"/>
@@ -4022,12 +3920,6 @@
         </w:tc>
       </w:tr>
       <w:tr>
-        <w:tblPrEx>
-          <w:tblCellMar>
-            <w:top w:w="0" w:type="dxa"/>
-            <w:bottom w:w="0" w:type="dxa"/>
-          </w:tblCellMar>
-        </w:tblPrEx>
         <w:tc>
           <w:tcPr>
             <w:tcW w:w="2340" w:type="dxa"/>
@@ -4441,12 +4333,6 @@
         <w:gridCol w:w="2340"/>
       </w:tblGrid>
       <w:tr>
-        <w:tblPrEx>
-          <w:tblCellMar>
-            <w:top w:w="0" w:type="dxa"/>
-            <w:bottom w:w="0" w:type="dxa"/>
-          </w:tblCellMar>
-        </w:tblPrEx>
         <w:tc>
           <w:tcPr>
             <w:tcW w:w="2340" w:type="dxa"/>
@@ -4629,12 +4515,6 @@
         </w:tc>
       </w:tr>
       <w:tr>
-        <w:tblPrEx>
-          <w:tblCellMar>
-            <w:top w:w="0" w:type="dxa"/>
-            <w:bottom w:w="0" w:type="dxa"/>
-          </w:tblCellMar>
-        </w:tblPrEx>
         <w:tc>
           <w:tcPr>
             <w:tcW w:w="2340" w:type="dxa"/>
@@ -4802,12 +4682,6 @@
         </w:tc>
       </w:tr>
       <w:tr>
-        <w:tblPrEx>
-          <w:tblCellMar>
-            <w:top w:w="0" w:type="dxa"/>
-            <w:bottom w:w="0" w:type="dxa"/>
-          </w:tblCellMar>
-        </w:tblPrEx>
         <w:tc>
           <w:tcPr>
             <w:tcW w:w="2340" w:type="dxa"/>
@@ -4975,12 +4849,6 @@
         </w:tc>
       </w:tr>
       <w:tr>
-        <w:tblPrEx>
-          <w:tblCellMar>
-            <w:top w:w="0" w:type="dxa"/>
-            <w:bottom w:w="0" w:type="dxa"/>
-          </w:tblCellMar>
-        </w:tblPrEx>
         <w:tc>
           <w:tcPr>
             <w:tcW w:w="2340" w:type="dxa"/>
@@ -5148,12 +5016,6 @@
         </w:tc>
       </w:tr>
       <w:tr>
-        <w:tblPrEx>
-          <w:tblCellMar>
-            <w:top w:w="0" w:type="dxa"/>
-            <w:bottom w:w="0" w:type="dxa"/>
-          </w:tblCellMar>
-        </w:tblPrEx>
         <w:tc>
           <w:tcPr>
             <w:tcW w:w="2340" w:type="dxa"/>
@@ -5321,12 +5183,6 @@
         </w:tc>
       </w:tr>
       <w:tr>
-        <w:tblPrEx>
-          <w:tblCellMar>
-            <w:top w:w="0" w:type="dxa"/>
-            <w:bottom w:w="0" w:type="dxa"/>
-          </w:tblCellMar>
-        </w:tblPrEx>
         <w:tc>
           <w:tcPr>
             <w:tcW w:w="2340" w:type="dxa"/>
@@ -5533,12 +5389,6 @@
         <w:gridCol w:w="3120"/>
       </w:tblGrid>
       <w:tr>
-        <w:tblPrEx>
-          <w:tblCellMar>
-            <w:top w:w="0" w:type="dxa"/>
-            <w:bottom w:w="0" w:type="dxa"/>
-          </w:tblCellMar>
-        </w:tblPrEx>
         <w:tc>
           <w:tcPr>
             <w:tcW w:w="3120" w:type="dxa"/>
@@ -5649,12 +5499,6 @@
         </w:tc>
       </w:tr>
       <w:tr>
-        <w:tblPrEx>
-          <w:tblCellMar>
-            <w:top w:w="0" w:type="dxa"/>
-            <w:bottom w:w="0" w:type="dxa"/>
-          </w:tblCellMar>
-        </w:tblPrEx>
         <w:tc>
           <w:tcPr>
             <w:tcW w:w="3120" w:type="dxa"/>
@@ -5756,12 +5600,6 @@
         </w:tc>
       </w:tr>
       <w:tr>
-        <w:tblPrEx>
-          <w:tblCellMar>
-            <w:top w:w="0" w:type="dxa"/>
-            <w:bottom w:w="0" w:type="dxa"/>
-          </w:tblCellMar>
-        </w:tblPrEx>
         <w:tc>
           <w:tcPr>
             <w:tcW w:w="3120" w:type="dxa"/>
@@ -5863,12 +5701,6 @@
         </w:tc>
       </w:tr>
       <w:tr>
-        <w:tblPrEx>
-          <w:tblCellMar>
-            <w:top w:w="0" w:type="dxa"/>
-            <w:bottom w:w="0" w:type="dxa"/>
-          </w:tblCellMar>
-        </w:tblPrEx>
         <w:tc>
           <w:tcPr>
             <w:tcW w:w="3120" w:type="dxa"/>
@@ -5970,12 +5802,6 @@
         </w:tc>
       </w:tr>
       <w:tr>
-        <w:tblPrEx>
-          <w:tblCellMar>
-            <w:top w:w="0" w:type="dxa"/>
-            <w:bottom w:w="0" w:type="dxa"/>
-          </w:tblCellMar>
-        </w:tblPrEx>
         <w:tc>
           <w:tcPr>
             <w:tcW w:w="3120" w:type="dxa"/>
@@ -6077,12 +5903,6 @@
         </w:tc>
       </w:tr>
       <w:tr>
-        <w:tblPrEx>
-          <w:tblCellMar>
-            <w:top w:w="0" w:type="dxa"/>
-            <w:bottom w:w="0" w:type="dxa"/>
-          </w:tblCellMar>
-        </w:tblPrEx>
         <w:tc>
           <w:tcPr>
             <w:tcW w:w="3120" w:type="dxa"/>
@@ -6763,12 +6583,6 @@
         <w:gridCol w:w="6240"/>
       </w:tblGrid>
       <w:tr>
-        <w:tblPrEx>
-          <w:tblCellMar>
-            <w:top w:w="0" w:type="dxa"/>
-            <w:bottom w:w="0" w:type="dxa"/>
-          </w:tblCellMar>
-        </w:tblPrEx>
         <w:tc>
           <w:tcPr>
             <w:tcW w:w="3120" w:type="dxa"/>
@@ -6843,12 +6657,6 @@
         </w:tc>
       </w:tr>
       <w:tr>
-        <w:tblPrEx>
-          <w:tblCellMar>
-            <w:top w:w="0" w:type="dxa"/>
-            <w:bottom w:w="0" w:type="dxa"/>
-          </w:tblCellMar>
-        </w:tblPrEx>
         <w:tc>
           <w:tcPr>
             <w:tcW w:w="3120" w:type="dxa"/>
@@ -6917,12 +6725,6 @@
         </w:tc>
       </w:tr>
       <w:tr>
-        <w:tblPrEx>
-          <w:tblCellMar>
-            <w:top w:w="0" w:type="dxa"/>
-            <w:bottom w:w="0" w:type="dxa"/>
-          </w:tblCellMar>
-        </w:tblPrEx>
         <w:tc>
           <w:tcPr>
             <w:tcW w:w="3120" w:type="dxa"/>
@@ -6991,12 +6793,6 @@
         </w:tc>
       </w:tr>
       <w:tr>
-        <w:tblPrEx>
-          <w:tblCellMar>
-            <w:top w:w="0" w:type="dxa"/>
-            <w:bottom w:w="0" w:type="dxa"/>
-          </w:tblCellMar>
-        </w:tblPrEx>
         <w:tc>
           <w:tcPr>
             <w:tcW w:w="3120" w:type="dxa"/>
@@ -7065,12 +6861,6 @@
         </w:tc>
       </w:tr>
       <w:tr>
-        <w:tblPrEx>
-          <w:tblCellMar>
-            <w:top w:w="0" w:type="dxa"/>
-            <w:bottom w:w="0" w:type="dxa"/>
-          </w:tblCellMar>
-        </w:tblPrEx>
         <w:tc>
           <w:tcPr>
             <w:tcW w:w="3120" w:type="dxa"/>
@@ -7139,12 +6929,6 @@
         </w:tc>
       </w:tr>
       <w:tr>
-        <w:tblPrEx>
-          <w:tblCellMar>
-            <w:top w:w="0" w:type="dxa"/>
-            <w:bottom w:w="0" w:type="dxa"/>
-          </w:tblCellMar>
-        </w:tblPrEx>
         <w:tc>
           <w:tcPr>
             <w:tcW w:w="3120" w:type="dxa"/>
@@ -7213,12 +6997,6 @@
         </w:tc>
       </w:tr>
       <w:tr>
-        <w:tblPrEx>
-          <w:tblCellMar>
-            <w:top w:w="0" w:type="dxa"/>
-            <w:bottom w:w="0" w:type="dxa"/>
-          </w:tblCellMar>
-        </w:tblPrEx>
         <w:tc>
           <w:tcPr>
             <w:tcW w:w="3120" w:type="dxa"/>
@@ -7287,12 +7065,6 @@
         </w:tc>
       </w:tr>
       <w:tr>
-        <w:tblPrEx>
-          <w:tblCellMar>
-            <w:top w:w="0" w:type="dxa"/>
-            <w:bottom w:w="0" w:type="dxa"/>
-          </w:tblCellMar>
-        </w:tblPrEx>
         <w:tc>
           <w:tcPr>
             <w:tcW w:w="3120" w:type="dxa"/>
@@ -7361,12 +7133,6 @@
         </w:tc>
       </w:tr>
       <w:tr>
-        <w:tblPrEx>
-          <w:tblCellMar>
-            <w:top w:w="0" w:type="dxa"/>
-            <w:bottom w:w="0" w:type="dxa"/>
-          </w:tblCellMar>
-        </w:tblPrEx>
         <w:tc>
           <w:tcPr>
             <w:tcW w:w="3120" w:type="dxa"/>
@@ -7435,12 +7201,6 @@
         </w:tc>
       </w:tr>
       <w:tr>
-        <w:tblPrEx>
-          <w:tblCellMar>
-            <w:top w:w="0" w:type="dxa"/>
-            <w:bottom w:w="0" w:type="dxa"/>
-          </w:tblCellMar>
-        </w:tblPrEx>
         <w:tc>
           <w:tcPr>
             <w:tcW w:w="3120" w:type="dxa"/>
@@ -7877,7 +7637,37 @@
           <w:sz w:val="20"/>
           <w:szCs w:val="20"/>
         </w:rPr>
-        <w:t>End of Report  |  Yeruva Bala Shreya Reddy  |  May 2026</w:t>
+        <w:t xml:space="preserve">End of Report  |  Yeruva Bala Shreya Reddy  |  </w:t>
+      </w:r>
+      <w:r>
+        <w:rPr>
+          <w:rFonts w:ascii="Times New Roman" w:hAnsi="Times New Roman" w:cs="Times New Roman"/>
+          <w:i/>
+          <w:iCs/>
+          <w:sz w:val="20"/>
+          <w:szCs w:val="20"/>
+        </w:rPr>
+        <w:t>Dec</w:t>
+      </w:r>
+      <w:r>
+        <w:rPr>
+          <w:rFonts w:ascii="Times New Roman" w:hAnsi="Times New Roman" w:cs="Times New Roman"/>
+          <w:i/>
+          <w:iCs/>
+          <w:sz w:val="20"/>
+          <w:szCs w:val="20"/>
+        </w:rPr>
+        <w:t xml:space="preserve"> 20</w:t>
+      </w:r>
+      <w:r>
+        <w:rPr>
+          <w:rFonts w:ascii="Times New Roman" w:hAnsi="Times New Roman" w:cs="Times New Roman"/>
+          <w:i/>
+          <w:iCs/>
+          <w:sz w:val="20"/>
+          <w:szCs w:val="20"/>
+        </w:rPr>
+        <w:t>25</w:t>
       </w:r>
     </w:p>
     <w:sectPr>

</xml_diff>